<commit_message>
Dodata kolona datum rodjenja u tabeli korisnici u fajlu arhitektura baze.docx
</commit_message>
<xml_diff>
--- a/docs/Arhitektura baze.docx
+++ b/docs/Arhitektura baze.docx
@@ -51,6 +51,7 @@
     <w:p>
       <w:pPr>
         <w:numPr>
+          <w:ilvl w:val="0"/>
           <w:numId w:val="0"/>
         </w:numPr>
         <w:ind w:leftChars="0"/>
@@ -83,6 +84,7 @@
     <w:p>
       <w:pPr>
         <w:numPr>
+          <w:ilvl w:val="0"/>
           <w:numId w:val="0"/>
         </w:numPr>
         <w:ind w:leftChars="0"/>
@@ -115,6 +117,7 @@
     <w:p>
       <w:pPr>
         <w:numPr>
+          <w:ilvl w:val="0"/>
           <w:numId w:val="0"/>
         </w:numPr>
         <w:ind w:leftChars="0"/>
@@ -147,6 +150,7 @@
     <w:p>
       <w:pPr>
         <w:numPr>
+          <w:ilvl w:val="0"/>
           <w:numId w:val="0"/>
         </w:numPr>
         <w:ind w:leftChars="0"/>
@@ -179,6 +183,7 @@
     <w:p>
       <w:pPr>
         <w:numPr>
+          <w:ilvl w:val="0"/>
           <w:numId w:val="0"/>
         </w:numPr>
         <w:ind w:leftChars="0"/>
@@ -211,6 +216,7 @@
     <w:p>
       <w:pPr>
         <w:numPr>
+          <w:ilvl w:val="0"/>
           <w:numId w:val="0"/>
         </w:numPr>
         <w:ind w:leftChars="0"/>
@@ -243,6 +249,7 @@
     <w:p>
       <w:pPr>
         <w:numPr>
+          <w:ilvl w:val="0"/>
           <w:numId w:val="0"/>
         </w:numPr>
         <w:ind w:leftChars="0"/>
@@ -275,6 +282,7 @@
     <w:p>
       <w:pPr>
         <w:numPr>
+          <w:ilvl w:val="0"/>
           <w:numId w:val="0"/>
         </w:numPr>
         <w:ind w:leftChars="0"/>
@@ -307,6 +315,7 @@
     <w:p>
       <w:pPr>
         <w:numPr>
+          <w:ilvl w:val="0"/>
           <w:numId w:val="0"/>
         </w:numPr>
         <w:ind w:leftChars="0"/>
@@ -339,6 +348,7 @@
     <w:p>
       <w:pPr>
         <w:numPr>
+          <w:ilvl w:val="0"/>
           <w:numId w:val="0"/>
         </w:numPr>
         <w:ind w:leftChars="0"/>
@@ -375,6 +385,7 @@
     <w:p>
       <w:pPr>
         <w:numPr>
+          <w:ilvl w:val="0"/>
           <w:numId w:val="0"/>
         </w:numPr>
         <w:ind w:leftChars="0"/>
@@ -411,6 +422,7 @@
     <w:p>
       <w:pPr>
         <w:numPr>
+          <w:ilvl w:val="0"/>
           <w:numId w:val="0"/>
         </w:numPr>
         <w:ind w:leftChars="0"/>
@@ -451,6 +463,7 @@
     <w:p>
       <w:pPr>
         <w:numPr>
+          <w:ilvl w:val="0"/>
           <w:numId w:val="0"/>
         </w:numPr>
         <w:ind w:leftChars="0"/>
@@ -495,6 +508,7 @@
     <w:p>
       <w:pPr>
         <w:numPr>
+          <w:ilvl w:val="0"/>
           <w:numId w:val="0"/>
         </w:numPr>
         <w:ind w:leftChars="0"/>
@@ -539,6 +553,7 @@
     <w:p>
       <w:pPr>
         <w:numPr>
+          <w:ilvl w:val="0"/>
           <w:numId w:val="0"/>
         </w:numPr>
         <w:ind w:leftChars="0"/>
@@ -583,6 +598,7 @@
     <w:p>
       <w:pPr>
         <w:numPr>
+          <w:ilvl w:val="0"/>
           <w:numId w:val="0"/>
         </w:numPr>
         <w:ind w:leftChars="0"/>
@@ -627,6 +643,7 @@
     <w:p>
       <w:pPr>
         <w:numPr>
+          <w:ilvl w:val="0"/>
           <w:numId w:val="0"/>
         </w:numPr>
         <w:ind w:leftChars="0"/>
@@ -671,6 +688,7 @@
     <w:p>
       <w:pPr>
         <w:numPr>
+          <w:ilvl w:val="0"/>
           <w:numId w:val="0"/>
         </w:numPr>
         <w:ind w:leftChars="0"/>
@@ -3571,8 +3589,6 @@
         </w:rPr>
         <w:t>kreirano: 2026-03-19 16:00</w:t>
       </w:r>
-      <w:bookmarkStart w:id="0" w:name="_GoBack"/>
-      <w:bookmarkEnd w:id="0"/>
     </w:p>
     <w:p>
       <w:pPr>
@@ -7969,51 +7985,18 @@
           <w:iCs w:val="0"/>
           <w:lang w:val="en-US"/>
         </w:rPr>
-        <w:t>email</w:t>
-      </w:r>
-      <w:r>
-        <w:rPr>
-          <w:rFonts w:hint="default"/>
-          <w:b w:val="0"/>
-          <w:bCs w:val="0"/>
-          <w:i w:val="0"/>
-          <w:iCs w:val="0"/>
-          <w:lang w:val="en-US"/>
-        </w:rPr>
-        <w:tab/>
-      </w:r>
-      <w:r>
-        <w:rPr>
-          <w:rFonts w:hint="default"/>
-          <w:b w:val="0"/>
-          <w:bCs w:val="0"/>
-          <w:i w:val="0"/>
-          <w:iCs w:val="0"/>
-          <w:lang w:val="en-US"/>
-        </w:rPr>
-        <w:tab/>
-      </w:r>
-      <w:r>
-        <w:rPr>
-          <w:rFonts w:hint="default"/>
-          <w:b w:val="0"/>
-          <w:bCs w:val="0"/>
-          <w:i w:val="0"/>
-          <w:iCs w:val="0"/>
-          <w:lang w:val="en-US"/>
-        </w:rPr>
-        <w:tab/>
-      </w:r>
-      <w:r>
-        <w:rPr>
-          <w:rFonts w:hint="default"/>
-          <w:b w:val="0"/>
-          <w:bCs w:val="0"/>
-          <w:i w:val="0"/>
-          <w:iCs w:val="0"/>
-          <w:lang w:val="en-US"/>
-        </w:rPr>
-        <w:t>VARCHAR(200)  NOT NULL, UNIQUE,</w:t>
+        <w:t xml:space="preserve">datum_rodjenja                </w:t>
+      </w:r>
+      <w:r>
+        <w:rPr>
+          <w:rFonts w:hint="default"/>
+          <w:b w:val="0"/>
+          <w:bCs w:val="0"/>
+          <w:i w:val="0"/>
+          <w:iCs w:val="0"/>
+          <w:lang w:val="en-US"/>
+        </w:rPr>
+        <w:t>DATE        NOT  NULL,</w:t>
       </w:r>
     </w:p>
     <w:p>
@@ -8052,7 +8035,7 @@
           <w:iCs w:val="0"/>
           <w:lang w:val="en-US"/>
         </w:rPr>
-        <w:t>lozinka_hash</w:t>
+        <w:t>email</w:t>
       </w:r>
       <w:r>
         <w:rPr>
@@ -8085,7 +8068,18 @@
           <w:iCs w:val="0"/>
           <w:lang w:val="en-US"/>
         </w:rPr>
-        <w:t>VARCHAR(500)  NOT NULL,</w:t>
+        <w:tab/>
+      </w:r>
+      <w:r>
+        <w:rPr>
+          <w:rFonts w:hint="default"/>
+          <w:b w:val="0"/>
+          <w:bCs w:val="0"/>
+          <w:i w:val="0"/>
+          <w:iCs w:val="0"/>
+          <w:lang w:val="en-US"/>
+        </w:rPr>
+        <w:t>VARCHAR(200)  NOT NULL, UNIQUE,</w:t>
       </w:r>
     </w:p>
     <w:p>
@@ -8124,7 +8118,7 @@
           <w:iCs w:val="0"/>
           <w:lang w:val="en-US"/>
         </w:rPr>
-        <w:t>id_uloge</w:t>
+        <w:t>lozinka_hash</w:t>
       </w:r>
       <w:r>
         <w:rPr>
@@ -8157,7 +8151,7 @@
           <w:iCs w:val="0"/>
           <w:lang w:val="en-US"/>
         </w:rPr>
-        <w:t>INT           NOT NULL, FK -&gt; uloge.id ON DELETE RESTRICT,</w:t>
+        <w:t>VARCHAR(500)  NOT NULL,</w:t>
       </w:r>
     </w:p>
     <w:p>
@@ -8196,7 +8190,7 @@
           <w:iCs w:val="0"/>
           <w:lang w:val="en-US"/>
         </w:rPr>
-        <w:t>verifikovan</w:t>
+        <w:t>id_uloge</w:t>
       </w:r>
       <w:r>
         <w:rPr>
@@ -8229,7 +8223,7 @@
           <w:iCs w:val="0"/>
           <w:lang w:val="en-US"/>
         </w:rPr>
-        <w:t>BOOLEAN       NOT NULL, DEFAULT FALSE,</w:t>
+        <w:t>INT           NOT NULL, FK -&gt; uloge.id ON DELETE RESTRICT,</w:t>
       </w:r>
     </w:p>
     <w:p>
@@ -8268,7 +8262,7 @@
           <w:iCs w:val="0"/>
           <w:lang w:val="en-US"/>
         </w:rPr>
-        <w:t>jezik</w:t>
+        <w:t>verifikovan</w:t>
       </w:r>
       <w:r>
         <w:rPr>
@@ -8301,18 +8295,7 @@
           <w:iCs w:val="0"/>
           <w:lang w:val="en-US"/>
         </w:rPr>
-        <w:tab/>
-      </w:r>
-      <w:r>
-        <w:rPr>
-          <w:rFonts w:hint="default"/>
-          <w:b w:val="0"/>
-          <w:bCs w:val="0"/>
-          <w:i w:val="0"/>
-          <w:iCs w:val="0"/>
-          <w:lang w:val="en-US"/>
-        </w:rPr>
-        <w:t>VARCHAR(5)    NOT NULL, DEFAULT 'sr', CHECK (jezik IN ('sr', 'en', 'de', 'fr', 'it')),</w:t>
+        <w:t>BOOLEAN       NOT NULL, DEFAULT FALSE,</w:t>
       </w:r>
     </w:p>
     <w:p>
@@ -8351,7 +8334,7 @@
           <w:iCs w:val="0"/>
           <w:lang w:val="en-US"/>
         </w:rPr>
-        <w:t>verif_token</w:t>
+        <w:t>jezik</w:t>
       </w:r>
       <w:r>
         <w:rPr>
@@ -8384,7 +8367,18 @@
           <w:iCs w:val="0"/>
           <w:lang w:val="en-US"/>
         </w:rPr>
-        <w:t>VARCHAR(200)  NULL,</w:t>
+        <w:tab/>
+      </w:r>
+      <w:r>
+        <w:rPr>
+          <w:rFonts w:hint="default"/>
+          <w:b w:val="0"/>
+          <w:bCs w:val="0"/>
+          <w:i w:val="0"/>
+          <w:iCs w:val="0"/>
+          <w:lang w:val="en-US"/>
+        </w:rPr>
+        <w:t>VARCHAR(5)    NOT NULL, DEFAULT 'sr', CHECK (jezik IN ('sr', 'en', 'de', 'fr', 'it')),</w:t>
       </w:r>
     </w:p>
     <w:p>
@@ -8423,7 +8417,7 @@
           <w:iCs w:val="0"/>
           <w:lang w:val="en-US"/>
         </w:rPr>
-        <w:t>verif_token_istek</w:t>
+        <w:t>verif_token</w:t>
       </w:r>
       <w:r>
         <w:rPr>
@@ -8445,7 +8439,18 @@
           <w:iCs w:val="0"/>
           <w:lang w:val="en-US"/>
         </w:rPr>
-        <w:t>TIMESTAMPTZ   NULL,</w:t>
+        <w:tab/>
+      </w:r>
+      <w:r>
+        <w:rPr>
+          <w:rFonts w:hint="default"/>
+          <w:b w:val="0"/>
+          <w:bCs w:val="0"/>
+          <w:i w:val="0"/>
+          <w:iCs w:val="0"/>
+          <w:lang w:val="en-US"/>
+        </w:rPr>
+        <w:t>VARCHAR(200)  NULL,</w:t>
       </w:r>
     </w:p>
     <w:p>
@@ -8484,7 +8489,7 @@
           <w:iCs w:val="0"/>
           <w:lang w:val="en-US"/>
         </w:rPr>
-        <w:t>reset_token</w:t>
+        <w:t>verif_token_istek</w:t>
       </w:r>
       <w:r>
         <w:rPr>
@@ -8506,18 +8511,7 @@
           <w:iCs w:val="0"/>
           <w:lang w:val="en-US"/>
         </w:rPr>
-        <w:tab/>
-      </w:r>
-      <w:r>
-        <w:rPr>
-          <w:rFonts w:hint="default"/>
-          <w:b w:val="0"/>
-          <w:bCs w:val="0"/>
-          <w:i w:val="0"/>
-          <w:iCs w:val="0"/>
-          <w:lang w:val="en-US"/>
-        </w:rPr>
-        <w:t>VARCHAR(200)  NULL,</w:t>
+        <w:t>TIMESTAMPTZ   NULL,</w:t>
       </w:r>
     </w:p>
     <w:p>
@@ -8556,7 +8550,7 @@
           <w:iCs w:val="0"/>
           <w:lang w:val="en-US"/>
         </w:rPr>
-        <w:t>reset_token_istek</w:t>
+        <w:t>reset_token</w:t>
       </w:r>
       <w:r>
         <w:rPr>
@@ -8578,7 +8572,18 @@
           <w:iCs w:val="0"/>
           <w:lang w:val="en-US"/>
         </w:rPr>
-        <w:t>TIMESTAMPTZ   NULL,</w:t>
+        <w:tab/>
+      </w:r>
+      <w:r>
+        <w:rPr>
+          <w:rFonts w:hint="default"/>
+          <w:b w:val="0"/>
+          <w:bCs w:val="0"/>
+          <w:i w:val="0"/>
+          <w:iCs w:val="0"/>
+          <w:lang w:val="en-US"/>
+        </w:rPr>
+        <w:t>VARCHAR(200)  NULL,</w:t>
       </w:r>
     </w:p>
     <w:p>
@@ -8617,7 +8622,57 @@
           <w:iCs w:val="0"/>
           <w:lang w:val="en-US"/>
         </w:rPr>
-        <w:t>aktivan</w:t>
+        <w:t>reset_token_istek</w:t>
+      </w:r>
+      <w:r>
+        <w:rPr>
+          <w:rFonts w:hint="default"/>
+          <w:b w:val="0"/>
+          <w:bCs w:val="0"/>
+          <w:i w:val="0"/>
+          <w:iCs w:val="0"/>
+          <w:lang w:val="en-US"/>
+        </w:rPr>
+        <w:tab/>
+      </w:r>
+      <w:r>
+        <w:rPr>
+          <w:rFonts w:hint="default"/>
+          <w:b w:val="0"/>
+          <w:bCs w:val="0"/>
+          <w:i w:val="0"/>
+          <w:iCs w:val="0"/>
+          <w:lang w:val="en-US"/>
+        </w:rPr>
+        <w:t>TIMESTAMPTZ   NULL,</w:t>
+      </w:r>
+    </w:p>
+    <w:p>
+      <w:pPr>
+        <w:numPr>
+          <w:ilvl w:val="0"/>
+          <w:numId w:val="0"/>
+        </w:numPr>
+        <w:ind w:leftChars="0"/>
+        <w:rPr>
+          <w:rFonts w:hint="default"/>
+          <w:b w:val="0"/>
+          <w:bCs w:val="0"/>
+          <w:i w:val="0"/>
+          <w:iCs w:val="0"/>
+          <w:lang w:val="en-US"/>
+        </w:rPr>
+      </w:pPr>
+      <w:r>
+        <w:rPr>
+          <w:rFonts w:hint="default"/>
+          <w:b w:val="0"/>
+          <w:bCs w:val="0"/>
+          <w:i w:val="0"/>
+          <w:iCs w:val="0"/>
+          <w:lang w:val="en-US"/>
+        </w:rPr>
+        <w:t xml:space="preserve">  </w:t>
       </w:r>
       <w:r>
         <w:rPr>
@@ -8628,57 +8683,7 @@
           <w:iCs w:val="0"/>
           <w:lang w:val="en-US"/>
         </w:rPr>
-        <w:tab/>
-      </w:r>
-      <w:r>
-        <w:rPr>
-          <w:rFonts w:hint="default"/>
-          <w:b w:val="0"/>
-          <w:bCs w:val="0"/>
-          <w:i w:val="0"/>
-          <w:iCs w:val="0"/>
-          <w:lang w:val="en-US"/>
-        </w:rPr>
-        <w:tab/>
-      </w:r>
-      <w:r>
-        <w:rPr>
-          <w:rFonts w:hint="default"/>
-          <w:b w:val="0"/>
-          <w:bCs w:val="0"/>
-          <w:i w:val="0"/>
-          <w:iCs w:val="0"/>
-          <w:lang w:val="en-US"/>
-        </w:rPr>
-        <w:t>BOOLEAN       NOT NULL, DEFAULT TRUE,</w:t>
-      </w:r>
-    </w:p>
-    <w:p>
-      <w:pPr>
-        <w:numPr>
-          <w:ilvl w:val="0"/>
-          <w:numId w:val="0"/>
-        </w:numPr>
-        <w:ind w:leftChars="0"/>
-        <w:rPr>
-          <w:rFonts w:hint="default"/>
-          <w:b w:val="0"/>
-          <w:bCs w:val="0"/>
-          <w:i w:val="0"/>
-          <w:iCs w:val="0"/>
-          <w:lang w:val="en-US"/>
-        </w:rPr>
-      </w:pPr>
-      <w:r>
-        <w:rPr>
-          <w:rFonts w:hint="default"/>
-          <w:b w:val="0"/>
-          <w:bCs w:val="0"/>
-          <w:i w:val="0"/>
-          <w:iCs w:val="0"/>
-          <w:lang w:val="en-US"/>
-        </w:rPr>
-        <w:t xml:space="preserve"> </w:t>
+        <w:t>aktivan</w:t>
       </w:r>
       <w:r>
         <w:rPr>
@@ -8689,17 +8694,6 @@
           <w:iCs w:val="0"/>
           <w:lang w:val="en-US"/>
         </w:rPr>
-        <w:t xml:space="preserve"> kreirano</w:t>
-      </w:r>
-      <w:r>
-        <w:rPr>
-          <w:rFonts w:hint="default"/>
-          <w:b w:val="0"/>
-          <w:bCs w:val="0"/>
-          <w:i w:val="0"/>
-          <w:iCs w:val="0"/>
-          <w:lang w:val="en-US"/>
-        </w:rPr>
         <w:tab/>
       </w:r>
       <w:r>
@@ -8722,7 +8716,7 @@
           <w:iCs w:val="0"/>
           <w:lang w:val="en-US"/>
         </w:rPr>
-        <w:t>TIMESTAMPTZ   NOT NULL, DEFAULT NOW(),</w:t>
+        <w:t>BOOLEAN       NOT NULL, DEFAULT TRUE,</w:t>
       </w:r>
     </w:p>
     <w:p>
@@ -8761,6 +8755,78 @@
           <w:iCs w:val="0"/>
           <w:lang w:val="en-US"/>
         </w:rPr>
+        <w:t xml:space="preserve"> kreirano</w:t>
+      </w:r>
+      <w:r>
+        <w:rPr>
+          <w:rFonts w:hint="default"/>
+          <w:b w:val="0"/>
+          <w:bCs w:val="0"/>
+          <w:i w:val="0"/>
+          <w:iCs w:val="0"/>
+          <w:lang w:val="en-US"/>
+        </w:rPr>
+        <w:tab/>
+      </w:r>
+      <w:r>
+        <w:rPr>
+          <w:rFonts w:hint="default"/>
+          <w:b w:val="0"/>
+          <w:bCs w:val="0"/>
+          <w:i w:val="0"/>
+          <w:iCs w:val="0"/>
+          <w:lang w:val="en-US"/>
+        </w:rPr>
+        <w:tab/>
+      </w:r>
+      <w:r>
+        <w:rPr>
+          <w:rFonts w:hint="default"/>
+          <w:b w:val="0"/>
+          <w:bCs w:val="0"/>
+          <w:i w:val="0"/>
+          <w:iCs w:val="0"/>
+          <w:lang w:val="en-US"/>
+        </w:rPr>
+        <w:t>TIMESTAMPTZ   NOT NULL, DEFAULT NOW(),</w:t>
+      </w:r>
+    </w:p>
+    <w:p>
+      <w:pPr>
+        <w:numPr>
+          <w:ilvl w:val="0"/>
+          <w:numId w:val="0"/>
+        </w:numPr>
+        <w:ind w:leftChars="0"/>
+        <w:rPr>
+          <w:rFonts w:hint="default"/>
+          <w:b w:val="0"/>
+          <w:bCs w:val="0"/>
+          <w:i w:val="0"/>
+          <w:iCs w:val="0"/>
+          <w:lang w:val="en-US"/>
+        </w:rPr>
+      </w:pPr>
+      <w:r>
+        <w:rPr>
+          <w:rFonts w:hint="default"/>
+          <w:b w:val="0"/>
+          <w:bCs w:val="0"/>
+          <w:i w:val="0"/>
+          <w:iCs w:val="0"/>
+          <w:lang w:val="en-US"/>
+        </w:rPr>
+        <w:t xml:space="preserve"> </w:t>
+      </w:r>
+      <w:r>
+        <w:rPr>
+          <w:rFonts w:hint="default"/>
+          <w:b/>
+          <w:bCs/>
+          <w:i w:val="0"/>
+          <w:iCs w:val="0"/>
+          <w:lang w:val="en-US"/>
+        </w:rPr>
         <w:t xml:space="preserve"> izmenjeno</w:t>
       </w:r>
       <w:r>
@@ -8923,6 +8989,36 @@
           <w:iCs w:val="0"/>
           <w:lang w:val="en-US"/>
         </w:rPr>
+        <w:t>datum_rodjenja — datum rođenja korisnik, koristi se za personalizovane preporuke po uzrasnoj grupi</w:t>
+      </w:r>
+      <w:bookmarkStart w:id="0" w:name="_GoBack"/>
+      <w:bookmarkEnd w:id="0"/>
+    </w:p>
+    <w:p>
+      <w:pPr>
+        <w:numPr>
+          <w:ilvl w:val="0"/>
+          <w:numId w:val="0"/>
+        </w:numPr>
+        <w:ind w:leftChars="0"/>
+        <w:rPr>
+          <w:rFonts w:hint="default"/>
+          <w:b w:val="0"/>
+          <w:bCs w:val="0"/>
+          <w:i w:val="0"/>
+          <w:iCs w:val="0"/>
+          <w:lang w:val="en-US"/>
+        </w:rPr>
+      </w:pPr>
+      <w:r>
+        <w:rPr>
+          <w:rFonts w:hint="default"/>
+          <w:b w:val="0"/>
+          <w:bCs w:val="0"/>
+          <w:i w:val="0"/>
+          <w:iCs w:val="0"/>
+          <w:lang w:val="en-US"/>
+        </w:rPr>
         <w:t>email - jedinstven, koristi se za login</w:t>
       </w:r>
     </w:p>
@@ -9668,35 +9764,35 @@
           <w:iCs w:val="0"/>
           <w:lang w:val="en-US"/>
         </w:rPr>
-        <w:t>kreirano: 2026-03-18 14:22:00</w:t>
-      </w:r>
-    </w:p>
-    <w:p>
-      <w:pPr>
-        <w:numPr>
-          <w:ilvl w:val="0"/>
-          <w:numId w:val="0"/>
-        </w:numPr>
-        <w:ind w:leftChars="0"/>
-        <w:rPr>
-          <w:rFonts w:hint="default"/>
-          <w:b w:val="0"/>
-          <w:bCs w:val="0"/>
-          <w:i w:val="0"/>
-          <w:iCs w:val="0"/>
-          <w:lang w:val="en-US"/>
-        </w:rPr>
-      </w:pPr>
-      <w:r>
-        <w:rPr>
-          <w:rFonts w:hint="default"/>
-          <w:b w:val="0"/>
-          <w:bCs w:val="0"/>
-          <w:i w:val="0"/>
-          <w:iCs w:val="0"/>
-          <w:lang w:val="en-US"/>
-        </w:rPr>
-        <w:t>izmenjeno: 2026-03-18 14:22:00</w:t>
+        <w:t>kreirano: 2026-03-18 14:22</w:t>
+      </w:r>
+    </w:p>
+    <w:p>
+      <w:pPr>
+        <w:numPr>
+          <w:ilvl w:val="0"/>
+          <w:numId w:val="0"/>
+        </w:numPr>
+        <w:ind w:leftChars="0"/>
+        <w:rPr>
+          <w:rFonts w:hint="default"/>
+          <w:b w:val="0"/>
+          <w:bCs w:val="0"/>
+          <w:i w:val="0"/>
+          <w:iCs w:val="0"/>
+          <w:lang w:val="en-US"/>
+        </w:rPr>
+      </w:pPr>
+      <w:r>
+        <w:rPr>
+          <w:rFonts w:hint="default"/>
+          <w:b w:val="0"/>
+          <w:bCs w:val="0"/>
+          <w:i w:val="0"/>
+          <w:iCs w:val="0"/>
+          <w:lang w:val="en-US"/>
+        </w:rPr>
+        <w:t>izmenjeno: 2026-03-18 14:22</w:t>
       </w:r>
     </w:p>
     <w:p>
@@ -12223,18 +12319,7 @@
           <w:iCs w:val="0"/>
           <w:lang w:val="en-US"/>
         </w:rPr>
-        <w:t>id</w:t>
-      </w:r>
-      <w:r>
-        <w:rPr>
-          <w:rFonts w:hint="default"/>
-          <w:b/>
-          <w:bCs/>
-          <w:i w:val="0"/>
-          <w:iCs w:val="0"/>
-          <w:lang w:val="en-US"/>
-        </w:rPr>
-        <w:t xml:space="preserve">_destinacije    </w:t>
+        <w:t xml:space="preserve">id_destinacije    </w:t>
       </w:r>
       <w:r>
         <w:rPr>
@@ -22367,7 +22452,7 @@
     <w:lsdException w:qFormat="1" w:unhideWhenUsed="0" w:uiPriority="0" w:semiHidden="0" w:name="Title"/>
     <w:lsdException w:unhideWhenUsed="0" w:uiPriority="0" w:semiHidden="0" w:name="Closing"/>
     <w:lsdException w:unhideWhenUsed="0" w:uiPriority="0" w:semiHidden="0" w:name="Signature"/>
-    <w:lsdException w:unhideWhenUsed="0" w:uiPriority="0" w:name="Default Paragraph Font"/>
+    <w:lsdException w:qFormat="1" w:unhideWhenUsed="0" w:uiPriority="0" w:name="Default Paragraph Font"/>
     <w:lsdException w:unhideWhenUsed="0" w:uiPriority="0" w:semiHidden="0" w:name="Body Text"/>
     <w:lsdException w:unhideWhenUsed="0" w:uiPriority="0" w:semiHidden="0" w:name="Body Text Indent"/>
     <w:lsdException w:unhideWhenUsed="0" w:uiPriority="0" w:semiHidden="0" w:name="List Continue"/>
@@ -22643,6 +22728,7 @@
   <w:style w:type="character" w:default="1" w:styleId="6">
     <w:name w:val="Default Paragraph Font"/>
     <w:semiHidden/>
+    <w:qFormat/>
     <w:uiPriority w:val="0"/>
   </w:style>
   <w:style w:type="table" w:default="1" w:styleId="7">

</xml_diff>

<commit_message>
Update Arhitektura baze dokument
</commit_message>
<xml_diff>
--- a/docs/Arhitektura baze.docx
+++ b/docs/Arhitektura baze.docx
@@ -51,7 +51,6 @@
     <w:p>
       <w:pPr>
         <w:numPr>
-          <w:ilvl w:val="0"/>
           <w:numId w:val="0"/>
         </w:numPr>
         <w:ind w:leftChars="0"/>
@@ -84,7 +83,6 @@
     <w:p>
       <w:pPr>
         <w:numPr>
-          <w:ilvl w:val="0"/>
           <w:numId w:val="0"/>
         </w:numPr>
         <w:ind w:leftChars="0"/>
@@ -117,7 +115,6 @@
     <w:p>
       <w:pPr>
         <w:numPr>
-          <w:ilvl w:val="0"/>
           <w:numId w:val="0"/>
         </w:numPr>
         <w:ind w:leftChars="0"/>
@@ -150,7 +147,6 @@
     <w:p>
       <w:pPr>
         <w:numPr>
-          <w:ilvl w:val="0"/>
           <w:numId w:val="0"/>
         </w:numPr>
         <w:ind w:leftChars="0"/>
@@ -183,7 +179,6 @@
     <w:p>
       <w:pPr>
         <w:numPr>
-          <w:ilvl w:val="0"/>
           <w:numId w:val="0"/>
         </w:numPr>
         <w:ind w:leftChars="0"/>
@@ -216,7 +211,6 @@
     <w:p>
       <w:pPr>
         <w:numPr>
-          <w:ilvl w:val="0"/>
           <w:numId w:val="0"/>
         </w:numPr>
         <w:ind w:leftChars="0"/>
@@ -249,7 +243,6 @@
     <w:p>
       <w:pPr>
         <w:numPr>
-          <w:ilvl w:val="0"/>
           <w:numId w:val="0"/>
         </w:numPr>
         <w:ind w:leftChars="0"/>
@@ -282,7 +275,6 @@
     <w:p>
       <w:pPr>
         <w:numPr>
-          <w:ilvl w:val="0"/>
           <w:numId w:val="0"/>
         </w:numPr>
         <w:ind w:leftChars="0"/>
@@ -315,7 +307,6 @@
     <w:p>
       <w:pPr>
         <w:numPr>
-          <w:ilvl w:val="0"/>
           <w:numId w:val="0"/>
         </w:numPr>
         <w:ind w:leftChars="0"/>
@@ -348,7 +339,6 @@
     <w:p>
       <w:pPr>
         <w:numPr>
-          <w:ilvl w:val="0"/>
           <w:numId w:val="0"/>
         </w:numPr>
         <w:ind w:leftChars="0"/>
@@ -385,7 +375,6 @@
     <w:p>
       <w:pPr>
         <w:numPr>
-          <w:ilvl w:val="0"/>
           <w:numId w:val="0"/>
         </w:numPr>
         <w:ind w:leftChars="0"/>
@@ -422,7 +411,6 @@
     <w:p>
       <w:pPr>
         <w:numPr>
-          <w:ilvl w:val="0"/>
           <w:numId w:val="0"/>
         </w:numPr>
         <w:ind w:leftChars="0"/>
@@ -463,7 +451,6 @@
     <w:p>
       <w:pPr>
         <w:numPr>
-          <w:ilvl w:val="0"/>
           <w:numId w:val="0"/>
         </w:numPr>
         <w:ind w:leftChars="0"/>
@@ -508,7 +495,6 @@
     <w:p>
       <w:pPr>
         <w:numPr>
-          <w:ilvl w:val="0"/>
           <w:numId w:val="0"/>
         </w:numPr>
         <w:ind w:leftChars="0"/>
@@ -553,7 +539,6 @@
     <w:p>
       <w:pPr>
         <w:numPr>
-          <w:ilvl w:val="0"/>
           <w:numId w:val="0"/>
         </w:numPr>
         <w:ind w:leftChars="0"/>
@@ -598,7 +583,6 @@
     <w:p>
       <w:pPr>
         <w:numPr>
-          <w:ilvl w:val="0"/>
           <w:numId w:val="0"/>
         </w:numPr>
         <w:ind w:leftChars="0"/>
@@ -643,7 +627,6 @@
     <w:p>
       <w:pPr>
         <w:numPr>
-          <w:ilvl w:val="0"/>
           <w:numId w:val="0"/>
         </w:numPr>
         <w:ind w:leftChars="0"/>
@@ -688,7 +671,6 @@
     <w:p>
       <w:pPr>
         <w:numPr>
-          <w:ilvl w:val="0"/>
           <w:numId w:val="0"/>
         </w:numPr>
         <w:ind w:leftChars="0"/>
@@ -3589,6 +3571,8 @@
         </w:rPr>
         <w:t>kreirano: 2026-03-19 16:00</w:t>
       </w:r>
+      <w:bookmarkStart w:id="0" w:name="_GoBack"/>
+      <w:bookmarkEnd w:id="0"/>
     </w:p>
     <w:p>
       <w:pPr>
@@ -7985,18 +7969,51 @@
           <w:iCs w:val="0"/>
           <w:lang w:val="en-US"/>
         </w:rPr>
-        <w:t xml:space="preserve">datum_rodjenja                </w:t>
-      </w:r>
-      <w:r>
-        <w:rPr>
-          <w:rFonts w:hint="default"/>
-          <w:b w:val="0"/>
-          <w:bCs w:val="0"/>
-          <w:i w:val="0"/>
-          <w:iCs w:val="0"/>
-          <w:lang w:val="en-US"/>
-        </w:rPr>
-        <w:t>DATE        NOT  NULL,</w:t>
+        <w:t>email</w:t>
+      </w:r>
+      <w:r>
+        <w:rPr>
+          <w:rFonts w:hint="default"/>
+          <w:b w:val="0"/>
+          <w:bCs w:val="0"/>
+          <w:i w:val="0"/>
+          <w:iCs w:val="0"/>
+          <w:lang w:val="en-US"/>
+        </w:rPr>
+        <w:tab/>
+      </w:r>
+      <w:r>
+        <w:rPr>
+          <w:rFonts w:hint="default"/>
+          <w:b w:val="0"/>
+          <w:bCs w:val="0"/>
+          <w:i w:val="0"/>
+          <w:iCs w:val="0"/>
+          <w:lang w:val="en-US"/>
+        </w:rPr>
+        <w:tab/>
+      </w:r>
+      <w:r>
+        <w:rPr>
+          <w:rFonts w:hint="default"/>
+          <w:b w:val="0"/>
+          <w:bCs w:val="0"/>
+          <w:i w:val="0"/>
+          <w:iCs w:val="0"/>
+          <w:lang w:val="en-US"/>
+        </w:rPr>
+        <w:tab/>
+      </w:r>
+      <w:r>
+        <w:rPr>
+          <w:rFonts w:hint="default"/>
+          <w:b w:val="0"/>
+          <w:bCs w:val="0"/>
+          <w:i w:val="0"/>
+          <w:iCs w:val="0"/>
+          <w:lang w:val="en-US"/>
+        </w:rPr>
+        <w:t>VARCHAR(200)  NOT NULL, UNIQUE,</w:t>
       </w:r>
     </w:p>
     <w:p>
@@ -8035,7 +8052,7 @@
           <w:iCs w:val="0"/>
           <w:lang w:val="en-US"/>
         </w:rPr>
-        <w:t>email</w:t>
+        <w:t>lozinka_hash</w:t>
       </w:r>
       <w:r>
         <w:rPr>
@@ -8068,18 +8085,7 @@
           <w:iCs w:val="0"/>
           <w:lang w:val="en-US"/>
         </w:rPr>
-        <w:tab/>
-      </w:r>
-      <w:r>
-        <w:rPr>
-          <w:rFonts w:hint="default"/>
-          <w:b w:val="0"/>
-          <w:bCs w:val="0"/>
-          <w:i w:val="0"/>
-          <w:iCs w:val="0"/>
-          <w:lang w:val="en-US"/>
-        </w:rPr>
-        <w:t>VARCHAR(200)  NOT NULL, UNIQUE,</w:t>
+        <w:t>VARCHAR(500)  NOT NULL,</w:t>
       </w:r>
     </w:p>
     <w:p>
@@ -8118,7 +8124,7 @@
           <w:iCs w:val="0"/>
           <w:lang w:val="en-US"/>
         </w:rPr>
-        <w:t>lozinka_hash</w:t>
+        <w:t>id_uloge</w:t>
       </w:r>
       <w:r>
         <w:rPr>
@@ -8151,7 +8157,7 @@
           <w:iCs w:val="0"/>
           <w:lang w:val="en-US"/>
         </w:rPr>
-        <w:t>VARCHAR(500)  NOT NULL,</w:t>
+        <w:t>INT           NOT NULL, FK -&gt; uloge.id ON DELETE RESTRICT,</w:t>
       </w:r>
     </w:p>
     <w:p>
@@ -8190,7 +8196,7 @@
           <w:iCs w:val="0"/>
           <w:lang w:val="en-US"/>
         </w:rPr>
-        <w:t>id_uloge</w:t>
+        <w:t>verifikovan</w:t>
       </w:r>
       <w:r>
         <w:rPr>
@@ -8223,7 +8229,7 @@
           <w:iCs w:val="0"/>
           <w:lang w:val="en-US"/>
         </w:rPr>
-        <w:t>INT           NOT NULL, FK -&gt; uloge.id ON DELETE RESTRICT,</w:t>
+        <w:t>BOOLEAN       NOT NULL, DEFAULT FALSE,</w:t>
       </w:r>
     </w:p>
     <w:p>
@@ -8262,7 +8268,7 @@
           <w:iCs w:val="0"/>
           <w:lang w:val="en-US"/>
         </w:rPr>
-        <w:t>verifikovan</w:t>
+        <w:t>jezik</w:t>
       </w:r>
       <w:r>
         <w:rPr>
@@ -8295,7 +8301,18 @@
           <w:iCs w:val="0"/>
           <w:lang w:val="en-US"/>
         </w:rPr>
-        <w:t>BOOLEAN       NOT NULL, DEFAULT FALSE,</w:t>
+        <w:tab/>
+      </w:r>
+      <w:r>
+        <w:rPr>
+          <w:rFonts w:hint="default"/>
+          <w:b w:val="0"/>
+          <w:bCs w:val="0"/>
+          <w:i w:val="0"/>
+          <w:iCs w:val="0"/>
+          <w:lang w:val="en-US"/>
+        </w:rPr>
+        <w:t>VARCHAR(5)    NOT NULL, DEFAULT 'sr', CHECK (jezik IN ('sr', 'en', 'de', 'fr', 'it')),</w:t>
       </w:r>
     </w:p>
     <w:p>
@@ -8334,7 +8351,7 @@
           <w:iCs w:val="0"/>
           <w:lang w:val="en-US"/>
         </w:rPr>
-        <w:t>jezik</w:t>
+        <w:t>verif_token</w:t>
       </w:r>
       <w:r>
         <w:rPr>
@@ -8367,18 +8384,7 @@
           <w:iCs w:val="0"/>
           <w:lang w:val="en-US"/>
         </w:rPr>
-        <w:tab/>
-      </w:r>
-      <w:r>
-        <w:rPr>
-          <w:rFonts w:hint="default"/>
-          <w:b w:val="0"/>
-          <w:bCs w:val="0"/>
-          <w:i w:val="0"/>
-          <w:iCs w:val="0"/>
-          <w:lang w:val="en-US"/>
-        </w:rPr>
-        <w:t>VARCHAR(5)    NOT NULL, DEFAULT 'sr', CHECK (jezik IN ('sr', 'en', 'de', 'fr', 'it')),</w:t>
+        <w:t>VARCHAR(200)  NULL,</w:t>
       </w:r>
     </w:p>
     <w:p>
@@ -8417,7 +8423,7 @@
           <w:iCs w:val="0"/>
           <w:lang w:val="en-US"/>
         </w:rPr>
-        <w:t>verif_token</w:t>
+        <w:t>verif_token_istek</w:t>
       </w:r>
       <w:r>
         <w:rPr>
@@ -8439,18 +8445,7 @@
           <w:iCs w:val="0"/>
           <w:lang w:val="en-US"/>
         </w:rPr>
-        <w:tab/>
-      </w:r>
-      <w:r>
-        <w:rPr>
-          <w:rFonts w:hint="default"/>
-          <w:b w:val="0"/>
-          <w:bCs w:val="0"/>
-          <w:i w:val="0"/>
-          <w:iCs w:val="0"/>
-          <w:lang w:val="en-US"/>
-        </w:rPr>
-        <w:t>VARCHAR(200)  NULL,</w:t>
+        <w:t>TIMESTAMPTZ   NULL,</w:t>
       </w:r>
     </w:p>
     <w:p>
@@ -8489,7 +8484,7 @@
           <w:iCs w:val="0"/>
           <w:lang w:val="en-US"/>
         </w:rPr>
-        <w:t>verif_token_istek</w:t>
+        <w:t>reset_token</w:t>
       </w:r>
       <w:r>
         <w:rPr>
@@ -8511,7 +8506,18 @@
           <w:iCs w:val="0"/>
           <w:lang w:val="en-US"/>
         </w:rPr>
-        <w:t>TIMESTAMPTZ   NULL,</w:t>
+        <w:tab/>
+      </w:r>
+      <w:r>
+        <w:rPr>
+          <w:rFonts w:hint="default"/>
+          <w:b w:val="0"/>
+          <w:bCs w:val="0"/>
+          <w:i w:val="0"/>
+          <w:iCs w:val="0"/>
+          <w:lang w:val="en-US"/>
+        </w:rPr>
+        <w:t>VARCHAR(200)  NULL,</w:t>
       </w:r>
     </w:p>
     <w:p>
@@ -8550,7 +8556,7 @@
           <w:iCs w:val="0"/>
           <w:lang w:val="en-US"/>
         </w:rPr>
-        <w:t>reset_token</w:t>
+        <w:t>reset_token_istek</w:t>
       </w:r>
       <w:r>
         <w:rPr>
@@ -8572,18 +8578,7 @@
           <w:iCs w:val="0"/>
           <w:lang w:val="en-US"/>
         </w:rPr>
-        <w:tab/>
-      </w:r>
-      <w:r>
-        <w:rPr>
-          <w:rFonts w:hint="default"/>
-          <w:b w:val="0"/>
-          <w:bCs w:val="0"/>
-          <w:i w:val="0"/>
-          <w:iCs w:val="0"/>
-          <w:lang w:val="en-US"/>
-        </w:rPr>
-        <w:t>VARCHAR(200)  NULL,</w:t>
+        <w:t>TIMESTAMPTZ   NULL,</w:t>
       </w:r>
     </w:p>
     <w:p>
@@ -8622,57 +8617,7 @@
           <w:iCs w:val="0"/>
           <w:lang w:val="en-US"/>
         </w:rPr>
-        <w:t>reset_token_istek</w:t>
-      </w:r>
-      <w:r>
-        <w:rPr>
-          <w:rFonts w:hint="default"/>
-          <w:b w:val="0"/>
-          <w:bCs w:val="0"/>
-          <w:i w:val="0"/>
-          <w:iCs w:val="0"/>
-          <w:lang w:val="en-US"/>
-        </w:rPr>
-        <w:tab/>
-      </w:r>
-      <w:r>
-        <w:rPr>
-          <w:rFonts w:hint="default"/>
-          <w:b w:val="0"/>
-          <w:bCs w:val="0"/>
-          <w:i w:val="0"/>
-          <w:iCs w:val="0"/>
-          <w:lang w:val="en-US"/>
-        </w:rPr>
-        <w:t>TIMESTAMPTZ   NULL,</w:t>
-      </w:r>
-    </w:p>
-    <w:p>
-      <w:pPr>
-        <w:numPr>
-          <w:ilvl w:val="0"/>
-          <w:numId w:val="0"/>
-        </w:numPr>
-        <w:ind w:leftChars="0"/>
-        <w:rPr>
-          <w:rFonts w:hint="default"/>
-          <w:b w:val="0"/>
-          <w:bCs w:val="0"/>
-          <w:i w:val="0"/>
-          <w:iCs w:val="0"/>
-          <w:lang w:val="en-US"/>
-        </w:rPr>
-      </w:pPr>
-      <w:r>
-        <w:rPr>
-          <w:rFonts w:hint="default"/>
-          <w:b w:val="0"/>
-          <w:bCs w:val="0"/>
-          <w:i w:val="0"/>
-          <w:iCs w:val="0"/>
-          <w:lang w:val="en-US"/>
-        </w:rPr>
-        <w:t xml:space="preserve">  </w:t>
+        <w:t>aktivan</w:t>
       </w:r>
       <w:r>
         <w:rPr>
@@ -8683,7 +8628,57 @@
           <w:iCs w:val="0"/>
           <w:lang w:val="en-US"/>
         </w:rPr>
-        <w:t>aktivan</w:t>
+        <w:tab/>
+      </w:r>
+      <w:r>
+        <w:rPr>
+          <w:rFonts w:hint="default"/>
+          <w:b w:val="0"/>
+          <w:bCs w:val="0"/>
+          <w:i w:val="0"/>
+          <w:iCs w:val="0"/>
+          <w:lang w:val="en-US"/>
+        </w:rPr>
+        <w:tab/>
+      </w:r>
+      <w:r>
+        <w:rPr>
+          <w:rFonts w:hint="default"/>
+          <w:b w:val="0"/>
+          <w:bCs w:val="0"/>
+          <w:i w:val="0"/>
+          <w:iCs w:val="0"/>
+          <w:lang w:val="en-US"/>
+        </w:rPr>
+        <w:t>BOOLEAN       NOT NULL, DEFAULT TRUE,</w:t>
+      </w:r>
+    </w:p>
+    <w:p>
+      <w:pPr>
+        <w:numPr>
+          <w:ilvl w:val="0"/>
+          <w:numId w:val="0"/>
+        </w:numPr>
+        <w:ind w:leftChars="0"/>
+        <w:rPr>
+          <w:rFonts w:hint="default"/>
+          <w:b w:val="0"/>
+          <w:bCs w:val="0"/>
+          <w:i w:val="0"/>
+          <w:iCs w:val="0"/>
+          <w:lang w:val="en-US"/>
+        </w:rPr>
+      </w:pPr>
+      <w:r>
+        <w:rPr>
+          <w:rFonts w:hint="default"/>
+          <w:b w:val="0"/>
+          <w:bCs w:val="0"/>
+          <w:i w:val="0"/>
+          <w:iCs w:val="0"/>
+          <w:lang w:val="en-US"/>
+        </w:rPr>
+        <w:t xml:space="preserve"> </w:t>
       </w:r>
       <w:r>
         <w:rPr>
@@ -8694,6 +8689,17 @@
           <w:iCs w:val="0"/>
           <w:lang w:val="en-US"/>
         </w:rPr>
+        <w:t xml:space="preserve"> kreirano</w:t>
+      </w:r>
+      <w:r>
+        <w:rPr>
+          <w:rFonts w:hint="default"/>
+          <w:b w:val="0"/>
+          <w:bCs w:val="0"/>
+          <w:i w:val="0"/>
+          <w:iCs w:val="0"/>
+          <w:lang w:val="en-US"/>
+        </w:rPr>
         <w:tab/>
       </w:r>
       <w:r>
@@ -8716,7 +8722,7 @@
           <w:iCs w:val="0"/>
           <w:lang w:val="en-US"/>
         </w:rPr>
-        <w:t>BOOLEAN       NOT NULL, DEFAULT TRUE,</w:t>
+        <w:t>TIMESTAMPTZ   NOT NULL, DEFAULT NOW(),</w:t>
       </w:r>
     </w:p>
     <w:p>
@@ -8755,7 +8761,7 @@
           <w:iCs w:val="0"/>
           <w:lang w:val="en-US"/>
         </w:rPr>
-        <w:t xml:space="preserve"> kreirano</w:t>
+        <w:t xml:space="preserve"> izmenjeno</w:t>
       </w:r>
       <w:r>
         <w:rPr>
@@ -8788,78 +8794,6 @@
           <w:iCs w:val="0"/>
           <w:lang w:val="en-US"/>
         </w:rPr>
-        <w:t>TIMESTAMPTZ   NOT NULL, DEFAULT NOW(),</w:t>
-      </w:r>
-    </w:p>
-    <w:p>
-      <w:pPr>
-        <w:numPr>
-          <w:ilvl w:val="0"/>
-          <w:numId w:val="0"/>
-        </w:numPr>
-        <w:ind w:leftChars="0"/>
-        <w:rPr>
-          <w:rFonts w:hint="default"/>
-          <w:b w:val="0"/>
-          <w:bCs w:val="0"/>
-          <w:i w:val="0"/>
-          <w:iCs w:val="0"/>
-          <w:lang w:val="en-US"/>
-        </w:rPr>
-      </w:pPr>
-      <w:r>
-        <w:rPr>
-          <w:rFonts w:hint="default"/>
-          <w:b w:val="0"/>
-          <w:bCs w:val="0"/>
-          <w:i w:val="0"/>
-          <w:iCs w:val="0"/>
-          <w:lang w:val="en-US"/>
-        </w:rPr>
-        <w:t xml:space="preserve"> </w:t>
-      </w:r>
-      <w:r>
-        <w:rPr>
-          <w:rFonts w:hint="default"/>
-          <w:b/>
-          <w:bCs/>
-          <w:i w:val="0"/>
-          <w:iCs w:val="0"/>
-          <w:lang w:val="en-US"/>
-        </w:rPr>
-        <w:t xml:space="preserve"> izmenjeno</w:t>
-      </w:r>
-      <w:r>
-        <w:rPr>
-          <w:rFonts w:hint="default"/>
-          <w:b w:val="0"/>
-          <w:bCs w:val="0"/>
-          <w:i w:val="0"/>
-          <w:iCs w:val="0"/>
-          <w:lang w:val="en-US"/>
-        </w:rPr>
-        <w:tab/>
-      </w:r>
-      <w:r>
-        <w:rPr>
-          <w:rFonts w:hint="default"/>
-          <w:b w:val="0"/>
-          <w:bCs w:val="0"/>
-          <w:i w:val="0"/>
-          <w:iCs w:val="0"/>
-          <w:lang w:val="en-US"/>
-        </w:rPr>
-        <w:tab/>
-      </w:r>
-      <w:r>
-        <w:rPr>
-          <w:rFonts w:hint="default"/>
-          <w:b w:val="0"/>
-          <w:bCs w:val="0"/>
-          <w:i w:val="0"/>
-          <w:iCs w:val="0"/>
-          <w:lang w:val="en-US"/>
-        </w:rPr>
         <w:t>TIMESTAMPTZ   NOT NULL, DEFAULT NOW()</w:t>
       </w:r>
     </w:p>
@@ -8989,36 +8923,6 @@
           <w:iCs w:val="0"/>
           <w:lang w:val="en-US"/>
         </w:rPr>
-        <w:t>datum_rodjenja — datum rođenja korisnik, koristi se za personalizovane preporuke po uzrasnoj grupi</w:t>
-      </w:r>
-      <w:bookmarkStart w:id="0" w:name="_GoBack"/>
-      <w:bookmarkEnd w:id="0"/>
-    </w:p>
-    <w:p>
-      <w:pPr>
-        <w:numPr>
-          <w:ilvl w:val="0"/>
-          <w:numId w:val="0"/>
-        </w:numPr>
-        <w:ind w:leftChars="0"/>
-        <w:rPr>
-          <w:rFonts w:hint="default"/>
-          <w:b w:val="0"/>
-          <w:bCs w:val="0"/>
-          <w:i w:val="0"/>
-          <w:iCs w:val="0"/>
-          <w:lang w:val="en-US"/>
-        </w:rPr>
-      </w:pPr>
-      <w:r>
-        <w:rPr>
-          <w:rFonts w:hint="default"/>
-          <w:b w:val="0"/>
-          <w:bCs w:val="0"/>
-          <w:i w:val="0"/>
-          <w:iCs w:val="0"/>
-          <w:lang w:val="en-US"/>
-        </w:rPr>
         <w:t>email - jedinstven, koristi se za login</w:t>
       </w:r>
     </w:p>
@@ -9764,35 +9668,35 @@
           <w:iCs w:val="0"/>
           <w:lang w:val="en-US"/>
         </w:rPr>
-        <w:t>kreirano: 2026-03-18 14:22</w:t>
-      </w:r>
-    </w:p>
-    <w:p>
-      <w:pPr>
-        <w:numPr>
-          <w:ilvl w:val="0"/>
-          <w:numId w:val="0"/>
-        </w:numPr>
-        <w:ind w:leftChars="0"/>
-        <w:rPr>
-          <w:rFonts w:hint="default"/>
-          <w:b w:val="0"/>
-          <w:bCs w:val="0"/>
-          <w:i w:val="0"/>
-          <w:iCs w:val="0"/>
-          <w:lang w:val="en-US"/>
-        </w:rPr>
-      </w:pPr>
-      <w:r>
-        <w:rPr>
-          <w:rFonts w:hint="default"/>
-          <w:b w:val="0"/>
-          <w:bCs w:val="0"/>
-          <w:i w:val="0"/>
-          <w:iCs w:val="0"/>
-          <w:lang w:val="en-US"/>
-        </w:rPr>
-        <w:t>izmenjeno: 2026-03-18 14:22</w:t>
+        <w:t>kreirano: 2026-03-18 14:22:00</w:t>
+      </w:r>
+    </w:p>
+    <w:p>
+      <w:pPr>
+        <w:numPr>
+          <w:ilvl w:val="0"/>
+          <w:numId w:val="0"/>
+        </w:numPr>
+        <w:ind w:leftChars="0"/>
+        <w:rPr>
+          <w:rFonts w:hint="default"/>
+          <w:b w:val="0"/>
+          <w:bCs w:val="0"/>
+          <w:i w:val="0"/>
+          <w:iCs w:val="0"/>
+          <w:lang w:val="en-US"/>
+        </w:rPr>
+      </w:pPr>
+      <w:r>
+        <w:rPr>
+          <w:rFonts w:hint="default"/>
+          <w:b w:val="0"/>
+          <w:bCs w:val="0"/>
+          <w:i w:val="0"/>
+          <w:iCs w:val="0"/>
+          <w:lang w:val="en-US"/>
+        </w:rPr>
+        <w:t>izmenjeno: 2026-03-18 14:22:00</w:t>
       </w:r>
     </w:p>
     <w:p>
@@ -12319,7 +12223,18 @@
           <w:iCs w:val="0"/>
           <w:lang w:val="en-US"/>
         </w:rPr>
-        <w:t xml:space="preserve">id_destinacije    </w:t>
+        <w:t>id</w:t>
+      </w:r>
+      <w:r>
+        <w:rPr>
+          <w:rFonts w:hint="default"/>
+          <w:b/>
+          <w:bCs/>
+          <w:i w:val="0"/>
+          <w:iCs w:val="0"/>
+          <w:lang w:val="en-US"/>
+        </w:rPr>
+        <w:t xml:space="preserve">_destinacije    </w:t>
       </w:r>
       <w:r>
         <w:rPr>
@@ -22452,7 +22367,7 @@
     <w:lsdException w:qFormat="1" w:unhideWhenUsed="0" w:uiPriority="0" w:semiHidden="0" w:name="Title"/>
     <w:lsdException w:unhideWhenUsed="0" w:uiPriority="0" w:semiHidden="0" w:name="Closing"/>
     <w:lsdException w:unhideWhenUsed="0" w:uiPriority="0" w:semiHidden="0" w:name="Signature"/>
-    <w:lsdException w:qFormat="1" w:unhideWhenUsed="0" w:uiPriority="0" w:name="Default Paragraph Font"/>
+    <w:lsdException w:unhideWhenUsed="0" w:uiPriority="0" w:name="Default Paragraph Font"/>
     <w:lsdException w:unhideWhenUsed="0" w:uiPriority="0" w:semiHidden="0" w:name="Body Text"/>
     <w:lsdException w:unhideWhenUsed="0" w:uiPriority="0" w:semiHidden="0" w:name="Body Text Indent"/>
     <w:lsdException w:unhideWhenUsed="0" w:uiPriority="0" w:semiHidden="0" w:name="List Continue"/>
@@ -22728,7 +22643,6 @@
   <w:style w:type="character" w:default="1" w:styleId="6">
     <w:name w:val="Default Paragraph Font"/>
     <w:semiHidden/>
-    <w:qFormat/>
     <w:uiPriority w:val="0"/>
   </w:style>
   <w:style w:type="table" w:default="1" w:styleId="7">

</xml_diff>